<commit_message>
Fixed Assignment 4 Word Doc
</commit_message>
<xml_diff>
--- a/Module-4/Module 4 Assignment.docx
+++ b/Module-4/Module 4 Assignment.docx
@@ -21,24 +21,14 @@
       <w:pPr>
         <w:jc w:val="center"/>
       </w:pPr>
-      <w:r>
-        <w:fldChar w:fldCharType="begin"/>
-      </w:r>
-      <w:r>
-        <w:instrText>HYPERLINK "https://github.com/BobbyJoeCool/csd460-blueteam"</w:instrText>
-      </w:r>
-      <w:r>
-        <w:fldChar w:fldCharType="separate"/>
-      </w:r>
-      <w:r>
-        <w:rPr>
-          <w:rStyle w:val="Hyperlink"/>
-        </w:rPr>
-        <w:t>Blue Teams GitHub Repo</w:t>
-      </w:r>
-      <w:r>
-        <w:fldChar w:fldCharType="end"/>
-      </w:r>
+      <w:hyperlink r:id="rId7" w:history="1">
+        <w:r>
+          <w:rPr>
+            <w:rStyle w:val="Hyperlink"/>
+          </w:rPr>
+          <w:t>Blue Teams GitHub Repo</w:t>
+        </w:r>
+      </w:hyperlink>
     </w:p>
     <w:p>
       <w:pPr>
@@ -76,31 +66,11 @@
     </w:p>
     <w:p>
       <w:pPr>
-        <w:pStyle w:val="ListParagraph"/>
-        <w:numPr>
-          <w:ilvl w:val="0"/>
-          <w:numId w:val="4"/>
-        </w:numPr>
         <w:spacing w:after="0" w:line="276" w:lineRule="auto"/>
         <w:rPr>
           <w:rStyle w:val="Heading3Char"/>
-          <w:rFonts w:eastAsiaTheme="minorHAnsi" w:cstheme="minorBidi"/>
-          <w:color w:val="auto"/>
-          <w:sz w:val="24"/>
-          <w:szCs w:val="24"/>
         </w:rPr>
       </w:pPr>
-      <w:r>
-        <w:t xml:space="preserve">Some of the tables have very verbose information and many rows, as we wanted to be able to </w:t>
-      </w:r>
-      <w:proofErr w:type="gramStart"/>
-      <w:r>
-        <w:t>actually use</w:t>
-      </w:r>
-      <w:proofErr w:type="gramEnd"/>
-      <w:r>
-        <w:t xml:space="preserve"> the waitlist and display it, so we used the MySQL workbench to export the tables as Excel Spreadsheets and inserted them in this document below.</w:t>
-      </w:r>
     </w:p>
     <w:p>
       <w:pPr>
@@ -136,29 +106,8 @@
         <w:spacing w:after="0" w:line="276" w:lineRule="auto"/>
       </w:pPr>
       <w:r>
-        <w:t xml:space="preserve">Tables: </w:t>
-      </w:r>
-      <w:proofErr w:type="spellStart"/>
-      <w:r>
-        <w:t>SlipSize</w:t>
-      </w:r>
-      <w:proofErr w:type="spellEnd"/>
-      <w:r>
-        <w:t xml:space="preserve">, </w:t>
-      </w:r>
-      <w:proofErr w:type="spellStart"/>
-      <w:r>
-        <w:t>WaitList</w:t>
-      </w:r>
-      <w:proofErr w:type="spellEnd"/>
-      <w:r>
-        <w:t xml:space="preserve">, </w:t>
-      </w:r>
-      <w:proofErr w:type="spellStart"/>
-      <w:r>
-        <w:t>BoatOwnership</w:t>
-      </w:r>
-      <w:proofErr w:type="spellEnd"/>
+        <w:t>Tables: SlipSize, WaitList, BoatOwnership</w:t>
+      </w:r>
     </w:p>
     <w:p>
       <w:pPr>
@@ -245,13 +194,8 @@
         <w:spacing w:after="0" w:line="276" w:lineRule="auto"/>
       </w:pPr>
       <w:r>
-        <w:t xml:space="preserve">Tables: Reservation, </w:t>
-      </w:r>
-      <w:proofErr w:type="spellStart"/>
-      <w:r>
-        <w:t>TerminationNotice</w:t>
-      </w:r>
-      <w:proofErr w:type="spellEnd"/>
+        <w:t>Tables: Reservation, TerminationNotice</w:t>
+      </w:r>
     </w:p>
     <w:p>
       <w:pPr>
@@ -263,15 +207,7 @@
         <w:spacing w:after="0" w:line="276" w:lineRule="auto"/>
       </w:pPr>
       <w:r>
-        <w:t xml:space="preserve">Took on </w:t>
-      </w:r>
-      <w:proofErr w:type="gramStart"/>
-      <w:r>
-        <w:t>being in charge of</w:t>
-      </w:r>
-      <w:proofErr w:type="gramEnd"/>
-      <w:r>
-        <w:t xml:space="preserve"> keeping track of Business Rules in a single space.</w:t>
+        <w:t>Took on being in charge of keeping track of Business Rules in a single space.</w:t>
       </w:r>
     </w:p>
     <w:p>
@@ -315,15 +251,7 @@
         <w:spacing w:after="0" w:line="276" w:lineRule="auto"/>
       </w:pPr>
       <w:r>
-        <w:t xml:space="preserve">Tables: </w:t>
-      </w:r>
-      <w:proofErr w:type="spellStart"/>
-      <w:r>
-        <w:t>DatabaseVersion</w:t>
-      </w:r>
-      <w:proofErr w:type="spellEnd"/>
-      <w:r>
-        <w:t>, Dock, Employee, Slip, Contact</w:t>
+        <w:t>Tables: DatabaseVersion, Dock, Employee, Slip, Contact</w:t>
       </w:r>
     </w:p>
     <w:p>
@@ -377,7 +305,7 @@
                     <pic:cNvPicPr/>
                   </pic:nvPicPr>
                   <pic:blipFill>
-                    <a:blip r:embed="rId7">
+                    <a:blip r:embed="rId8">
                       <a:extLst>
                         <a:ext uri="{28A0092B-C50C-407E-A947-70E740481C1C}">
                           <a14:useLocalDpi xmlns:a14="http://schemas.microsoft.com/office/drawing/2010/main" val="0"/>
@@ -425,7 +353,7 @@
                     <pic:cNvPicPr/>
                   </pic:nvPicPr>
                   <pic:blipFill>
-                    <a:blip r:embed="rId8">
+                    <a:blip r:embed="rId9">
                       <a:extLst>
                         <a:ext uri="{28A0092B-C50C-407E-A947-70E740481C1C}">
                           <a14:useLocalDpi xmlns:a14="http://schemas.microsoft.com/office/drawing/2010/main" val="0"/>
@@ -473,7 +401,7 @@
                     <pic:cNvPicPr/>
                   </pic:nvPicPr>
                   <pic:blipFill>
-                    <a:blip r:embed="rId9">
+                    <a:blip r:embed="rId10">
                       <a:extLst>
                         <a:ext uri="{28A0092B-C50C-407E-A947-70E740481C1C}">
                           <a14:useLocalDpi xmlns:a14="http://schemas.microsoft.com/office/drawing/2010/main" val="0"/>
@@ -522,7 +450,7 @@
                     <pic:cNvPicPr/>
                   </pic:nvPicPr>
                   <pic:blipFill>
-                    <a:blip r:embed="rId10">
+                    <a:blip r:embed="rId11">
                       <a:extLst>
                         <a:ext uri="{28A0092B-C50C-407E-A947-70E740481C1C}">
                           <a14:useLocalDpi xmlns:a14="http://schemas.microsoft.com/office/drawing/2010/main" val="0"/>
@@ -571,7 +499,7 @@
                     <pic:cNvPicPr/>
                   </pic:nvPicPr>
                   <pic:blipFill>
-                    <a:blip r:embed="rId11">
+                    <a:blip r:embed="rId12">
                       <a:extLst>
                         <a:ext uri="{28A0092B-C50C-407E-A947-70E740481C1C}">
                           <a14:useLocalDpi xmlns:a14="http://schemas.microsoft.com/office/drawing/2010/main" val="0"/>
@@ -620,7 +548,7 @@
                     <pic:cNvPicPr/>
                   </pic:nvPicPr>
                   <pic:blipFill>
-                    <a:blip r:embed="rId12">
+                    <a:blip r:embed="rId13">
                       <a:extLst>
                         <a:ext uri="{28A0092B-C50C-407E-A947-70E740481C1C}">
                           <a14:useLocalDpi xmlns:a14="http://schemas.microsoft.com/office/drawing/2010/main" val="0"/>
@@ -668,7 +596,7 @@
                     <pic:cNvPicPr/>
                   </pic:nvPicPr>
                   <pic:blipFill>
-                    <a:blip r:embed="rId13">
+                    <a:blip r:embed="rId14">
                       <a:extLst>
                         <a:ext uri="{28A0092B-C50C-407E-A947-70E740481C1C}">
                           <a14:useLocalDpi xmlns:a14="http://schemas.microsoft.com/office/drawing/2010/main" val="0"/>
@@ -717,7 +645,7 @@
                     <pic:cNvPicPr/>
                   </pic:nvPicPr>
                   <pic:blipFill>
-                    <a:blip r:embed="rId14">
+                    <a:blip r:embed="rId15">
                       <a:extLst>
                         <a:ext uri="{28A0092B-C50C-407E-A947-70E740481C1C}">
                           <a14:useLocalDpi xmlns:a14="http://schemas.microsoft.com/office/drawing/2010/main" val="0"/>
@@ -766,7 +694,7 @@
                     <pic:cNvPicPr/>
                   </pic:nvPicPr>
                   <pic:blipFill>
-                    <a:blip r:embed="rId15">
+                    <a:blip r:embed="rId16">
                       <a:extLst>
                         <a:ext uri="{28A0092B-C50C-407E-A947-70E740481C1C}">
                           <a14:useLocalDpi xmlns:a14="http://schemas.microsoft.com/office/drawing/2010/main" val="0"/>
@@ -815,7 +743,7 @@
                     <pic:cNvPicPr/>
                   </pic:nvPicPr>
                   <pic:blipFill>
-                    <a:blip r:embed="rId16">
+                    <a:blip r:embed="rId17">
                       <a:extLst>
                         <a:ext uri="{28A0092B-C50C-407E-A947-70E740481C1C}">
                           <a14:useLocalDpi xmlns:a14="http://schemas.microsoft.com/office/drawing/2010/main" val="0"/>
@@ -864,7 +792,7 @@
                     <pic:cNvPicPr/>
                   </pic:nvPicPr>
                   <pic:blipFill>
-                    <a:blip r:embed="rId17">
+                    <a:blip r:embed="rId18">
                       <a:extLst>
                         <a:ext uri="{28A0092B-C50C-407E-A947-70E740481C1C}">
                           <a14:useLocalDpi xmlns:a14="http://schemas.microsoft.com/office/drawing/2010/main" val="0"/>
@@ -913,7 +841,7 @@
                     <pic:cNvPicPr/>
                   </pic:nvPicPr>
                   <pic:blipFill>
-                    <a:blip r:embed="rId18">
+                    <a:blip r:embed="rId19">
                       <a:extLst>
                         <a:ext uri="{28A0092B-C50C-407E-A947-70E740481C1C}">
                           <a14:useLocalDpi xmlns:a14="http://schemas.microsoft.com/office/drawing/2010/main" val="0"/>
@@ -942,9 +870,9 @@
     </w:p>
     <w:p/>
     <w:sectPr>
-      <w:headerReference w:type="even" r:id="rId19"/>
-      <w:headerReference w:type="default" r:id="rId20"/>
-      <w:headerReference w:type="first" r:id="rId21"/>
+      <w:headerReference w:type="even" r:id="rId20"/>
+      <w:headerReference w:type="default" r:id="rId21"/>
+      <w:headerReference w:type="first" r:id="rId22"/>
       <w:pgSz w:w="20160" w:h="12240" w:orient="landscape"/>
       <w:pgMar w:top="720" w:right="720" w:bottom="720" w:left="720" w:header="720" w:footer="720" w:gutter="0"/>
       <w:cols w:space="720"/>

</xml_diff>